<commit_message>
Actually commit the corrected v2 memorandum (previous commit missed it)
eea377fc's commit message correctly described the fix (56+/4 core
verticals, $13,436.56/6 months) but its recorded diff shows Bin 0 ->
697022 bytes — the size of the ORIGINAL uncorrected file, not the edited
697158-byte version. The real edit was sitting uncommitted in the working
tree this whole time. Verified via fresh extraction: HEAD still had
"1,000+"/"$35K" stale figures; the working-tree file has the real
"56+"/"$13,436.56" corrections. Committing the actual corrected bytes now.

Co-Authored-By: Claude Sonnet 5 <noreply@anthropic.com>
</commit_message>
<xml_diff>
--- a/apps/business/public/data-room/SOCIII-Investor-Memorandum-v2.docx
+++ b/apps/business/public/data-room/SOCIII-Investor-Memorandum-v2.docx
@@ -150,7 +150,7 @@
           <w:sz w:val="22"/>
           <w:szCs w:val="22"/>
         </w:rPr>
-        <w:t xml:space="preserve">1,000+ workers (state-augmented) live across 8 industries.</w:t>
+        <w:t xml:space="preserve">56+ workers live across 4 core verticals.</w:t>
       </w:r>
       <w:r>
         <w:rPr>
@@ -233,7 +233,7 @@
                 <w:sz w:val="22"/>
                 <w:szCs w:val="22"/>
               </w:rPr>
-              <w:t xml:space="preserve"> What you pay a senior engineer in a single month is approximately what SOCIII's AI tools require for an entire year — and they do the work of roughly 50 engineers. SOCIII does not hire and lay off armies of humans to scale; it starts without that exposure and grows as fast as the underlying AI models grow. The founder built a production platform across eight industries on $35K of operating burn over five months, validating the model before SOCIII Inc. ever opened a checking account.</w:t>
+              <w:t xml:space="preserve"> What you pay a senior engineer in a single month is approximately what SOCIII's AI tools require for an entire year — and they do the work of roughly 50 engineers. SOCIII does not hire and lay off armies of humans to scale; it starts without that exposure and grows as fast as the underlying AI models grow. The founder built a production platform across 4 core verticals on $13,436.56 of operating burn over 6 months, validating the model before SOCIII Inc. ever opened a checking account.</w:t>
             </w:r>
           </w:p>
         </w:tc>
@@ -311,7 +311,7 @@
                 <w:sz w:val="44"/>
                 <w:szCs w:val="44"/>
               </w:rPr>
-              <w:t xml:space="preserve">1,000+</w:t>
+              <w:t xml:space="preserve">56+</w:t>
             </w:r>
           </w:p>
           <w:p>
@@ -328,7 +328,7 @@
                 <w:sz w:val="14"/>
                 <w:szCs w:val="14"/>
               </w:rPr>
-              <w:t xml:space="preserve">WORKERS (STATE-AUGMENTED)</w:t>
+              <w:t xml:space="preserve">WORKERS</w:t>
             </w:r>
           </w:p>
         </w:tc>
@@ -361,7 +361,7 @@
                 <w:sz w:val="44"/>
                 <w:szCs w:val="44"/>
               </w:rPr>
-              <w:t xml:space="preserve">8</w:t>
+              <w:t xml:space="preserve">4</w:t>
             </w:r>
           </w:p>
           <w:p>
@@ -378,7 +378,7 @@
                 <w:sz w:val="14"/>
                 <w:szCs w:val="14"/>
               </w:rPr>
-              <w:t xml:space="preserve">LIVE INDUSTRIES</w:t>
+              <w:t xml:space="preserve">CORE VERTICALS</w:t>
             </w:r>
           </w:p>
         </w:tc>
@@ -411,7 +411,7 @@
                 <w:sz w:val="44"/>
                 <w:szCs w:val="44"/>
               </w:rPr>
-              <w:t xml:space="preserve">$35K</w:t>
+              <w:t xml:space="preserve">$13,436.56</w:t>
             </w:r>
           </w:p>
           <w:p>
@@ -428,7 +428,7 @@
                 <w:sz w:val="14"/>
                 <w:szCs w:val="14"/>
               </w:rPr>
-              <w:t xml:space="preserve">TOTAL BURN, 5 MONTHS</w:t>
+              <w:t xml:space="preserve">TOTAL BURN, 6 MONTHS</w:t>
             </w:r>
           </w:p>
         </w:tc>
@@ -626,7 +626,7 @@
           <w:sz w:val="22"/>
           <w:szCs w:val="22"/>
         </w:rPr>
-        <w:t xml:space="preserve">$35K in 5 months produced what VC-backed competitors spend $5M+ to build — ~200× compression versus traditional headcount-scaled engineering. The mechanism is the platform building the platform: SOCIII runs on SOCIII's own workers (Alex, Marketing, Accounting, HR, Contacts, Control Center), with Anthropic Claude as the lead developer. The next dollar of capital extends the ratio rather than resetting it.</w:t>
+        <w:t xml:space="preserve">$13,436.56 in 6 months produced what VC-backed competitors spend $5M+ to build — ~200× compression versus traditional headcount-scaled engineering. The mechanism is the platform building the platform: SOCIII runs on SOCIII's own workers (Alex, Marketing, Accounting, HR, Contacts, Control Center), with Anthropic Claude as the lead developer. The next dollar of capital extends the ratio rather than resetting it.</w:t>
       </w:r>
     </w:p>
     <w:tbl>
@@ -7244,7 +7244,7 @@
                 <w:sz w:val="20"/>
                 <w:szCs w:val="20"/>
               </w:rPr>
-              <w:t xml:space="preserve">SOCIII first 5 months (Jan–May 2026)</w:t>
+              <w:t xml:space="preserve">SOCIII first 6 months (Jan–Jun 2026)</w:t>
             </w:r>
           </w:p>
         </w:tc>
@@ -7280,7 +7280,7 @@
                 <w:sz w:val="20"/>
                 <w:szCs w:val="20"/>
               </w:rPr>
-              <w:t xml:space="preserve">~$35,000 total</w:t>
+              <w:t xml:space="preserve">~$13,436.56 total</w:t>
             </w:r>
           </w:p>
         </w:tc>
@@ -7314,7 +7314,7 @@
                 <w:sz w:val="20"/>
                 <w:szCs w:val="20"/>
               </w:rPr>
-              <w:t xml:space="preserve">1,000+ workers (state-augmented) shipped across 8 industries. Lead developer: Anthropic Claude. ~$5K/mo AI burn replaces a ~25-person dev shop.</w:t>
+              <w:t xml:space="preserve">56+ workers shipped across 4 core verticals. Lead developer: Anthropic Claude. ~$5K/mo AI burn replaces a ~25-person dev shop.</w:t>
             </w:r>
           </w:p>
         </w:tc>
@@ -7383,7 +7383,7 @@
                 <w:sz w:val="22"/>
                 <w:szCs w:val="22"/>
               </w:rPr>
-              <w:t xml:space="preserve"> What an established startup pays a single senior engineer in one month is roughly what SOCIII's AI development stack requires for a full year — while doing the work of approximately 50 engineers. Rather than hiring an engineering org and laying it off when the market turns, SOCIII starts without the exposure entirely and scales as fast as the underlying AI models scale. The prior-venture comparison (HOM DAO at $35K/week vs SOCIII at $35K/5-months) is the same point measured in dollars; the structural shift from distributed-token governance to sole-manager + AI-shop is the capital-efficiency mechanism.</w:t>
+              <w:t xml:space="preserve"> What an established startup pays a single senior engineer in one month is roughly what SOCIII's AI development stack requires for a full year — while doing the work of approximately 50 engineers. Rather than hiring an engineering org and laying it off when the market turns, SOCIII starts without the exposure entirely and scales as fast as the underlying AI models scale. The prior-venture comparison (HOM DAO at $35K/week vs SOCIII at $13,436.56/6-months) is the same point measured in dollars; the structural shift from distributed-token governance to sole-manager + AI-shop is the capital-efficiency mechanism.</w:t>
             </w:r>
           </w:p>
         </w:tc>
@@ -7984,7 +7984,7 @@
           <w:sz w:val="22"/>
           <w:szCs w:val="22"/>
         </w:rPr>
-        <w:t xml:space="preserve">the founding team has already demonstrated that it can build a production AI platform across eight industries on a budget that would not fund a single senior engineer hire at most agent-platform competitors. Capital efficiency is the most expensive thing to teach a founding team; SOCIII does not need to be taught.</w:t>
+        <w:t xml:space="preserve">the founding team has already demonstrated that it can build a production AI platform across 4 core verticals on a budget that would not fund a single senior engineer hire at most agent-platform competitors. Capital efficiency is the most expensive thing to teach a founding team; SOCIII does not need to be taught.</w:t>
       </w:r>
     </w:p>
     <w:p>

</xml_diff>